<commit_message>
Adicionado cálculo do limite para 2026.
</commit_message>
<xml_diff>
--- a/public/templates/decreto.docx
+++ b/public/templates/decreto.docx
@@ -6,12 +6,14 @@
       <w:pPr>
         <w:jc w:val="center"/>
         <w:rPr>
+          <w:rFonts w:ascii="Times New Roman" w:hAnsi="Times New Roman" w:cs="Times New Roman"/>
           <w:b/>
           <w:caps/>
         </w:rPr>
       </w:pPr>
       <w:r>
         <w:rPr>
+          <w:rFonts w:ascii="Times New Roman" w:hAnsi="Times New Roman" w:cs="Times New Roman"/>
           <w:b/>
           <w:caps/>
         </w:rPr>
@@ -20,35 +22,64 @@
       <w:proofErr w:type="spellStart"/>
       <w:r>
         <w:rPr>
+          <w:rFonts w:ascii="Times New Roman" w:hAnsi="Times New Roman" w:cs="Times New Roman"/>
           <w:b/>
           <w:caps/>
         </w:rPr>
-        <w:t>N.</w:t>
-      </w:r>
-      <w:r>
-        <w:rPr>
+        <w:t>N.°</w:t>
+      </w:r>
+      <w:proofErr w:type="spellEnd"/>
+      <w:r>
+        <w:rPr>
+          <w:rFonts w:ascii="Times New Roman" w:hAnsi="Times New Roman" w:cs="Times New Roman"/>
           <w:b/>
           <w:caps/>
         </w:rPr>
-        <w:t>°</w:t>
-      </w:r>
-      <w:proofErr w:type="spellEnd"/>
-      <w:r>
-        <w:rPr>
+        <w:t xml:space="preserve"> ${nr</w:t>
+      </w:r>
+      <w:r>
+        <w:rPr>
+          <w:rFonts w:ascii="Times New Roman" w:hAnsi="Times New Roman" w:cs="Times New Roman"/>
           <w:b/>
           <w:caps/>
         </w:rPr>
-        <w:t xml:space="preserve"> ${nr</w:t>
-      </w:r>
-      <w:r>
-        <w:rPr>
+        <w:t>Decreto</w:t>
+      </w:r>
+      <w:r>
+        <w:rPr>
+          <w:rFonts w:ascii="Times New Roman" w:hAnsi="Times New Roman" w:cs="Times New Roman"/>
           <w:b/>
           <w:caps/>
         </w:rPr>
+        <w:t>}</w:t>
+      </w:r>
+      <w:r>
+        <w:rPr>
+          <w:rFonts w:ascii="Times New Roman" w:hAnsi="Times New Roman" w:cs="Times New Roman"/>
+          <w:b/>
+          <w:caps/>
+        </w:rPr>
+        <w:t>, DE</w:t>
+      </w:r>
+      <w:r>
+        <w:rPr>
+          <w:rFonts w:ascii="Times New Roman" w:hAnsi="Times New Roman" w:cs="Times New Roman"/>
+          <w:b/>
+          <w:caps/>
+        </w:rPr>
+        <w:t xml:space="preserve"> ${data</w:t>
+      </w:r>
+      <w:r>
+        <w:rPr>
+          <w:rFonts w:ascii="Times New Roman" w:hAnsi="Times New Roman" w:cs="Times New Roman"/>
+          <w:b/>
+          <w:caps/>
+        </w:rPr>
         <w:t>Decreto</w:t>
       </w:r>
       <w:r>
         <w:rPr>
+          <w:rFonts w:ascii="Times New Roman" w:hAnsi="Times New Roman" w:cs="Times New Roman"/>
           <w:b/>
           <w:caps/>
         </w:rPr>
@@ -56,37 +87,10 @@
       </w:r>
       <w:r>
         <w:rPr>
+          <w:rFonts w:ascii="Times New Roman" w:hAnsi="Times New Roman" w:cs="Times New Roman"/>
           <w:b/>
           <w:caps/>
         </w:rPr>
-        <w:t>, DE</w:t>
-      </w:r>
-      <w:r>
-        <w:rPr>
-          <w:b/>
-          <w:caps/>
-        </w:rPr>
-        <w:t xml:space="preserve"> ${data</w:t>
-      </w:r>
-      <w:r>
-        <w:rPr>
-          <w:b/>
-          <w:caps/>
-        </w:rPr>
-        <w:t>Decreto</w:t>
-      </w:r>
-      <w:r>
-        <w:rPr>
-          <w:b/>
-          <w:caps/>
-        </w:rPr>
-        <w:t>}</w:t>
-      </w:r>
-      <w:r>
-        <w:rPr>
-          <w:b/>
-          <w:caps/>
-        </w:rPr>
         <w:t>.</w:t>
       </w:r>
     </w:p>
@@ -96,6 +100,7 @@
         <w:ind w:left="4394"/>
         <w:jc w:val="both"/>
         <w:rPr>
+          <w:rFonts w:ascii="Times New Roman" w:hAnsi="Times New Roman" w:cs="Times New Roman"/>
           <w:b/>
         </w:rPr>
       </w:pPr>
@@ -106,23 +111,27 @@
         <w:ind w:left="4394"/>
         <w:jc w:val="both"/>
         <w:rPr>
-          <w:b/>
-        </w:rPr>
-      </w:pPr>
-      <w:r>
-        <w:rPr>
+          <w:rFonts w:ascii="Times New Roman" w:hAnsi="Times New Roman" w:cs="Times New Roman"/>
+          <w:b/>
+        </w:rPr>
+      </w:pPr>
+      <w:r>
+        <w:rPr>
+          <w:rFonts w:ascii="Times New Roman" w:hAnsi="Times New Roman" w:cs="Times New Roman"/>
           <w:b/>
         </w:rPr>
         <w:t xml:space="preserve">ABRE CRÉDITO </w:t>
       </w:r>
       <w:r>
         <w:rPr>
+          <w:rFonts w:ascii="Times New Roman" w:hAnsi="Times New Roman" w:cs="Times New Roman"/>
           <w:b/>
         </w:rPr>
         <w:t>ADICIONAL</w:t>
       </w:r>
       <w:r>
         <w:rPr>
+          <w:rFonts w:ascii="Times New Roman" w:hAnsi="Times New Roman" w:cs="Times New Roman"/>
           <w:b/>
         </w:rPr>
         <w:t xml:space="preserve"> E DÁ OUTRAS PROVIDÊNCIAS.</w:t>
@@ -134,6 +143,7 @@
         <w:ind w:left="4395"/>
         <w:jc w:val="both"/>
         <w:rPr>
+          <w:rFonts w:ascii="Times New Roman" w:hAnsi="Times New Roman" w:cs="Times New Roman"/>
           <w:b/>
         </w:rPr>
       </w:pPr>
@@ -143,12 +153,18 @@
         <w:pStyle w:val="Standard"/>
         <w:ind w:left="4395"/>
         <w:jc w:val="both"/>
+        <w:rPr>
+          <w:rFonts w:ascii="Times New Roman" w:hAnsi="Times New Roman" w:cs="Times New Roman"/>
+        </w:rPr>
       </w:pPr>
     </w:p>
     <w:p>
       <w:pPr>
         <w:pStyle w:val="Ttulo"/>
         <w:jc w:val="both"/>
+        <w:rPr>
+          <w:rFonts w:ascii="Times New Roman" w:hAnsi="Times New Roman" w:cs="Times New Roman"/>
+        </w:rPr>
       </w:pPr>
       <w:r>
         <w:rPr>
@@ -160,7 +176,7 @@
       </w:r>
       <w:r>
         <w:rPr>
-          <w:rFonts w:ascii="Times New Roman" w:hAnsi="Times New Roman"/>
+          <w:rFonts w:ascii="Times New Roman" w:hAnsi="Times New Roman" w:cs="Times New Roman"/>
           <w:sz w:val="24"/>
           <w:szCs w:val="24"/>
         </w:rPr>
@@ -168,7 +184,7 @@
       </w:r>
       <w:r>
         <w:rPr>
-          <w:rFonts w:ascii="Times New Roman" w:hAnsi="Times New Roman"/>
+          <w:rFonts w:ascii="Times New Roman" w:hAnsi="Times New Roman" w:cs="Times New Roman"/>
           <w:b w:val="0"/>
           <w:sz w:val="24"/>
           <w:szCs w:val="24"/>
@@ -177,7 +193,7 @@
       </w:r>
       <w:r>
         <w:rPr>
-          <w:rFonts w:ascii="Times New Roman" w:hAnsi="Times New Roman"/>
+          <w:rFonts w:ascii="Times New Roman" w:hAnsi="Times New Roman" w:cs="Times New Roman"/>
           <w:b w:val="0"/>
           <w:sz w:val="24"/>
           <w:szCs w:val="24"/>
@@ -186,7 +202,7 @@
       </w:r>
       <w:r>
         <w:rPr>
-          <w:rFonts w:ascii="Times New Roman" w:hAnsi="Times New Roman"/>
+          <w:rFonts w:ascii="Times New Roman" w:hAnsi="Times New Roman" w:cs="Times New Roman"/>
           <w:b w:val="0"/>
           <w:sz w:val="24"/>
           <w:szCs w:val="24"/>
@@ -196,7 +212,7 @@
       <w:proofErr w:type="spellStart"/>
       <w:r>
         <w:rPr>
-          <w:rFonts w:ascii="Times New Roman" w:hAnsi="Times New Roman"/>
+          <w:rFonts w:ascii="Times New Roman" w:hAnsi="Times New Roman" w:cs="Times New Roman"/>
           <w:b w:val="0"/>
           <w:sz w:val="24"/>
           <w:szCs w:val="24"/>
@@ -206,7 +222,7 @@
       <w:proofErr w:type="spellEnd"/>
       <w:r>
         <w:rPr>
-          <w:rFonts w:ascii="Times New Roman" w:hAnsi="Times New Roman"/>
+          <w:rFonts w:ascii="Times New Roman" w:hAnsi="Times New Roman" w:cs="Times New Roman"/>
           <w:b w:val="0"/>
           <w:sz w:val="24"/>
           <w:szCs w:val="24"/>
@@ -216,7 +232,7 @@
       <w:proofErr w:type="spellStart"/>
       <w:r>
         <w:rPr>
-          <w:rFonts w:ascii="Times New Roman" w:hAnsi="Times New Roman"/>
+          <w:rFonts w:ascii="Times New Roman" w:hAnsi="Times New Roman" w:cs="Times New Roman"/>
           <w:b w:val="0"/>
           <w:sz w:val="24"/>
           <w:szCs w:val="24"/>
@@ -226,7 +242,7 @@
       <w:proofErr w:type="spellEnd"/>
       <w:r>
         <w:rPr>
-          <w:rFonts w:ascii="Times New Roman" w:hAnsi="Times New Roman"/>
+          <w:rFonts w:ascii="Times New Roman" w:hAnsi="Times New Roman" w:cs="Times New Roman"/>
           <w:b w:val="0"/>
           <w:sz w:val="24"/>
           <w:szCs w:val="24"/>
@@ -235,7 +251,7 @@
       </w:r>
       <w:r>
         <w:rPr>
-          <w:rFonts w:ascii="Times New Roman" w:hAnsi="Times New Roman"/>
+          <w:rFonts w:ascii="Times New Roman" w:hAnsi="Times New Roman" w:cs="Times New Roman"/>
           <w:b w:val="0"/>
           <w:sz w:val="24"/>
           <w:szCs w:val="24"/>
@@ -244,7 +260,7 @@
       </w:r>
       <w:r>
         <w:rPr>
-          <w:rFonts w:ascii="Times New Roman" w:hAnsi="Times New Roman"/>
+          <w:rFonts w:ascii="Times New Roman" w:hAnsi="Times New Roman" w:cs="Times New Roman"/>
           <w:b w:val="0"/>
           <w:sz w:val="24"/>
           <w:szCs w:val="24"/>
@@ -253,7 +269,7 @@
       </w:r>
       <w:r>
         <w:rPr>
-          <w:rFonts w:ascii="Times New Roman" w:hAnsi="Times New Roman"/>
+          <w:rFonts w:ascii="Times New Roman" w:hAnsi="Times New Roman" w:cs="Times New Roman"/>
           <w:b w:val="0"/>
           <w:sz w:val="24"/>
           <w:szCs w:val="24"/>
@@ -263,7 +279,7 @@
       <w:proofErr w:type="spellStart"/>
       <w:r>
         <w:rPr>
-          <w:rFonts w:ascii="Times New Roman" w:hAnsi="Times New Roman"/>
+          <w:rFonts w:ascii="Times New Roman" w:hAnsi="Times New Roman" w:cs="Times New Roman"/>
           <w:b w:val="0"/>
           <w:sz w:val="24"/>
           <w:szCs w:val="24"/>
@@ -273,7 +289,7 @@
       <w:proofErr w:type="spellEnd"/>
       <w:r>
         <w:rPr>
-          <w:rFonts w:ascii="Times New Roman" w:hAnsi="Times New Roman"/>
+          <w:rFonts w:ascii="Times New Roman" w:hAnsi="Times New Roman" w:cs="Times New Roman"/>
           <w:b w:val="0"/>
           <w:sz w:val="24"/>
           <w:szCs w:val="24"/>
@@ -282,7 +298,7 @@
       </w:r>
       <w:r>
         <w:rPr>
-          <w:rFonts w:ascii="Times New Roman" w:hAnsi="Times New Roman"/>
+          <w:rFonts w:ascii="Times New Roman" w:hAnsi="Times New Roman" w:cs="Times New Roman"/>
           <w:b w:val="0"/>
           <w:sz w:val="24"/>
           <w:szCs w:val="24"/>
@@ -295,6 +311,9 @@
         <w:pStyle w:val="Standard"/>
         <w:ind w:firstLine="1418"/>
         <w:jc w:val="both"/>
+        <w:rPr>
+          <w:rFonts w:ascii="Times New Roman" w:hAnsi="Times New Roman" w:cs="Times New Roman"/>
+        </w:rPr>
       </w:pPr>
     </w:p>
     <w:p>
@@ -303,11 +322,13 @@
         <w:ind w:firstLine="3366"/>
         <w:jc w:val="both"/>
         <w:rPr>
-          <w:b/>
-        </w:rPr>
-      </w:pPr>
-      <w:r>
-        <w:rPr>
+          <w:rFonts w:ascii="Times New Roman" w:hAnsi="Times New Roman" w:cs="Times New Roman"/>
+          <w:b/>
+        </w:rPr>
+      </w:pPr>
+      <w:r>
+        <w:rPr>
+          <w:rFonts w:ascii="Times New Roman" w:hAnsi="Times New Roman" w:cs="Times New Roman"/>
           <w:b/>
         </w:rPr>
         <w:t>DECRETA:</w:t>
@@ -319,20 +340,23 @@
         <w:ind w:firstLine="3480"/>
         <w:jc w:val="both"/>
         <w:rPr>
-          <w:b/>
-        </w:rPr>
-      </w:pPr>
-    </w:p>
-    <w:p>
-      <w:pPr>
-        <w:pStyle w:val="Standard"/>
-        <w:jc w:val="both"/>
-        <w:rPr>
+          <w:rFonts w:ascii="Times New Roman" w:hAnsi="Times New Roman" w:cs="Times New Roman"/>
+          <w:b/>
+        </w:rPr>
+      </w:pPr>
+    </w:p>
+    <w:p>
+      <w:pPr>
+        <w:pStyle w:val="Standard"/>
+        <w:jc w:val="both"/>
+        <w:rPr>
+          <w:rFonts w:ascii="Times New Roman" w:hAnsi="Times New Roman" w:cs="Times New Roman"/>
           <w:bCs/>
         </w:rPr>
       </w:pPr>
       <w:r>
         <w:rPr>
+          <w:rFonts w:ascii="Times New Roman" w:hAnsi="Times New Roman" w:cs="Times New Roman"/>
           <w:bCs/>
         </w:rPr>
         <w:t>${abertura}</w:t>
@@ -343,90 +367,134 @@
         <w:pStyle w:val="Standard"/>
         <w:ind w:firstLine="1134"/>
         <w:jc w:val="both"/>
-      </w:pPr>
-      <w:r>
-        <w:rPr>
+        <w:rPr>
+          <w:rFonts w:ascii="Times New Roman" w:hAnsi="Times New Roman" w:cs="Times New Roman"/>
+        </w:rPr>
+      </w:pPr>
+      <w:r>
+        <w:rPr>
+          <w:rFonts w:ascii="Times New Roman" w:hAnsi="Times New Roman" w:cs="Times New Roman"/>
           <w:b/>
         </w:rPr>
         <w:t xml:space="preserve">Art. </w:t>
       </w:r>
       <w:r>
         <w:rPr>
+          <w:rFonts w:ascii="Times New Roman" w:hAnsi="Times New Roman" w:cs="Times New Roman"/>
           <w:b/>
         </w:rPr>
         <w:t>${artigo}</w:t>
       </w:r>
       <w:r>
         <w:rPr>
+          <w:rFonts w:ascii="Times New Roman" w:hAnsi="Times New Roman" w:cs="Times New Roman"/>
           <w:b/>
         </w:rPr>
         <w:t>º</w:t>
       </w:r>
       <w:r>
+        <w:rPr>
+          <w:rFonts w:ascii="Times New Roman" w:hAnsi="Times New Roman" w:cs="Times New Roman"/>
+        </w:rPr>
         <w:t xml:space="preserve"> Fica aberto crédito </w:t>
       </w:r>
       <w:r>
+        <w:rPr>
+          <w:rFonts w:ascii="Times New Roman" w:hAnsi="Times New Roman" w:cs="Times New Roman"/>
+        </w:rPr>
         <w:t>${</w:t>
       </w:r>
       <w:proofErr w:type="spellStart"/>
       <w:r>
+        <w:rPr>
+          <w:rFonts w:ascii="Times New Roman" w:hAnsi="Times New Roman" w:cs="Times New Roman"/>
+        </w:rPr>
         <w:t>tipoCredito</w:t>
       </w:r>
       <w:proofErr w:type="spellEnd"/>
       <w:r>
+        <w:rPr>
+          <w:rFonts w:ascii="Times New Roman" w:hAnsi="Times New Roman" w:cs="Times New Roman"/>
+        </w:rPr>
         <w:t>}</w:t>
       </w:r>
       <w:r>
+        <w:rPr>
+          <w:rFonts w:ascii="Times New Roman" w:hAnsi="Times New Roman" w:cs="Times New Roman"/>
+        </w:rPr>
         <w:t xml:space="preserve"> </w:t>
       </w:r>
       <w:r>
+        <w:rPr>
+          <w:rFonts w:ascii="Times New Roman" w:hAnsi="Times New Roman" w:cs="Times New Roman"/>
+        </w:rPr>
         <w:t xml:space="preserve">no orçamento para o exercício de </w:t>
       </w:r>
       <w:r>
+        <w:rPr>
+          <w:rFonts w:ascii="Times New Roman" w:hAnsi="Times New Roman" w:cs="Times New Roman"/>
+        </w:rPr>
         <w:t>${</w:t>
       </w:r>
       <w:proofErr w:type="spellStart"/>
       <w:proofErr w:type="gramStart"/>
       <w:r>
         <w:rPr>
+          <w:rFonts w:ascii="Times New Roman" w:hAnsi="Times New Roman" w:cs="Times New Roman"/>
           <w:u w:val="single"/>
         </w:rPr>
         <w:t>exerc</w:t>
       </w:r>
       <w:r>
         <w:rPr>
+          <w:rFonts w:ascii="Times New Roman" w:hAnsi="Times New Roman" w:cs="Times New Roman"/>
           <w:u w:val="single"/>
         </w:rPr>
         <w:t>i</w:t>
       </w:r>
       <w:r>
         <w:rPr>
+          <w:rFonts w:ascii="Times New Roman" w:hAnsi="Times New Roman" w:cs="Times New Roman"/>
           <w:u w:val="single"/>
         </w:rPr>
         <w:t>cio</w:t>
       </w:r>
       <w:proofErr w:type="spellEnd"/>
       <w:r>
+        <w:rPr>
+          <w:rFonts w:ascii="Times New Roman" w:hAnsi="Times New Roman" w:cs="Times New Roman"/>
+        </w:rPr>
         <w:t xml:space="preserve">} </w:t>
       </w:r>
       <w:r>
+        <w:rPr>
+          <w:rFonts w:ascii="Times New Roman" w:hAnsi="Times New Roman" w:cs="Times New Roman"/>
+        </w:rPr>
         <w:t xml:space="preserve"> </w:t>
       </w:r>
       <w:r>
+        <w:rPr>
+          <w:rFonts w:ascii="Times New Roman" w:hAnsi="Times New Roman" w:cs="Times New Roman"/>
+        </w:rPr>
         <w:t>no</w:t>
       </w:r>
       <w:proofErr w:type="gramEnd"/>
       <w:r>
+        <w:rPr>
+          <w:rFonts w:ascii="Times New Roman" w:hAnsi="Times New Roman" w:cs="Times New Roman"/>
+        </w:rPr>
         <w:t xml:space="preserve"> valor de </w:t>
       </w:r>
       <w:r>
         <w:rPr>
+          <w:rFonts w:ascii="Times New Roman" w:hAnsi="Times New Roman" w:cs="Times New Roman"/>
           <w:b/>
         </w:rPr>
         <w:t xml:space="preserve">R$ </w:t>
       </w:r>
       <w:r>
         <w:rPr>
+          <w:rFonts w:ascii="Times New Roman" w:hAnsi="Times New Roman" w:cs="Times New Roman"/>
           <w:b/>
         </w:rPr>
         <w:t>${</w:t>
@@ -434,6 +502,7 @@
       <w:proofErr w:type="spellStart"/>
       <w:r>
         <w:rPr>
+          <w:rFonts w:ascii="Times New Roman" w:hAnsi="Times New Roman" w:cs="Times New Roman"/>
           <w:b/>
         </w:rPr>
         <w:t>totalTipoCredito</w:t>
@@ -441,11 +510,15 @@
       <w:proofErr w:type="spellEnd"/>
       <w:r>
         <w:rPr>
+          <w:rFonts w:ascii="Times New Roman" w:hAnsi="Times New Roman" w:cs="Times New Roman"/>
           <w:b/>
         </w:rPr>
         <w:t>}</w:t>
       </w:r>
       <w:r>
+        <w:rPr>
+          <w:rFonts w:ascii="Times New Roman" w:hAnsi="Times New Roman" w:cs="Times New Roman"/>
+        </w:rPr>
         <w:t xml:space="preserve"> conforme discriminado no Anexo Único deste Decreto.</w:t>
       </w:r>
     </w:p>
@@ -454,6 +527,7 @@
         <w:pStyle w:val="Standard"/>
         <w:jc w:val="both"/>
         <w:rPr>
+          <w:rFonts w:ascii="Times New Roman" w:hAnsi="Times New Roman" w:cs="Times New Roman"/>
           <w:b/>
         </w:rPr>
       </w:pPr>
@@ -463,50 +537,73 @@
         <w:pStyle w:val="Standard"/>
         <w:ind w:left="425" w:firstLine="709"/>
         <w:jc w:val="both"/>
-      </w:pPr>
-      <w:r>
-        <w:rPr>
+        <w:rPr>
+          <w:rFonts w:ascii="Times New Roman" w:hAnsi="Times New Roman" w:cs="Times New Roman"/>
+        </w:rPr>
+      </w:pPr>
+      <w:r>
+        <w:rPr>
+          <w:rFonts w:ascii="Times New Roman" w:hAnsi="Times New Roman" w:cs="Times New Roman"/>
           <w:b/>
         </w:rPr>
         <w:t>Parágrafo Único</w:t>
       </w:r>
       <w:r>
         <w:rPr>
+          <w:rFonts w:ascii="Times New Roman" w:hAnsi="Times New Roman" w:cs="Times New Roman"/>
           <w:b/>
         </w:rPr>
         <w:t xml:space="preserve"> </w:t>
       </w:r>
       <w:r>
+        <w:rPr>
+          <w:rFonts w:ascii="Times New Roman" w:hAnsi="Times New Roman" w:cs="Times New Roman"/>
+        </w:rPr>
         <w:t xml:space="preserve">Servirá de recurso para o crédito aberto no </w:t>
       </w:r>
       <w:r>
         <w:rPr>
+          <w:rFonts w:ascii="Times New Roman" w:hAnsi="Times New Roman" w:cs="Times New Roman"/>
           <w:i/>
         </w:rPr>
         <w:t>caput</w:t>
       </w:r>
       <w:r>
+        <w:rPr>
+          <w:rFonts w:ascii="Times New Roman" w:hAnsi="Times New Roman" w:cs="Times New Roman"/>
+        </w:rPr>
         <w:t xml:space="preserve"> ${</w:t>
       </w:r>
       <w:proofErr w:type="spellStart"/>
       <w:r>
+        <w:rPr>
+          <w:rFonts w:ascii="Times New Roman" w:hAnsi="Times New Roman" w:cs="Times New Roman"/>
+        </w:rPr>
         <w:t>tipoOrigem</w:t>
       </w:r>
       <w:proofErr w:type="spellEnd"/>
       <w:r>
+        <w:rPr>
+          <w:rFonts w:ascii="Times New Roman" w:hAnsi="Times New Roman" w:cs="Times New Roman"/>
+        </w:rPr>
         <w:t xml:space="preserve">} </w:t>
       </w:r>
       <w:r>
+        <w:rPr>
+          <w:rFonts w:ascii="Times New Roman" w:hAnsi="Times New Roman" w:cs="Times New Roman"/>
+        </w:rPr>
         <w:t xml:space="preserve">no valor de </w:t>
       </w:r>
       <w:r>
         <w:rPr>
+          <w:rFonts w:ascii="Times New Roman" w:hAnsi="Times New Roman" w:cs="Times New Roman"/>
           <w:b/>
         </w:rPr>
         <w:t xml:space="preserve">R$ </w:t>
       </w:r>
       <w:r>
         <w:rPr>
+          <w:rFonts w:ascii="Times New Roman" w:hAnsi="Times New Roman" w:cs="Times New Roman"/>
           <w:b/>
         </w:rPr>
         <w:t>${</w:t>
@@ -514,6 +611,7 @@
       <w:proofErr w:type="spellStart"/>
       <w:r>
         <w:rPr>
+          <w:rFonts w:ascii="Times New Roman" w:hAnsi="Times New Roman" w:cs="Times New Roman"/>
           <w:b/>
         </w:rPr>
         <w:t>totalOrigem</w:t>
@@ -521,14 +619,21 @@
       <w:proofErr w:type="spellEnd"/>
       <w:r>
         <w:rPr>
+          <w:rFonts w:ascii="Times New Roman" w:hAnsi="Times New Roman" w:cs="Times New Roman"/>
           <w:b/>
         </w:rPr>
         <w:t>}</w:t>
       </w:r>
       <w:r>
+        <w:rPr>
+          <w:rFonts w:ascii="Times New Roman" w:hAnsi="Times New Roman" w:cs="Times New Roman"/>
+        </w:rPr>
         <w:t xml:space="preserve"> conforme discriminado no Anexo Único deste Decreto</w:t>
       </w:r>
       <w:r>
+        <w:rPr>
+          <w:rFonts w:ascii="Times New Roman" w:hAnsi="Times New Roman" w:cs="Times New Roman"/>
+        </w:rPr>
         <w:t>.</w:t>
       </w:r>
     </w:p>
@@ -536,14 +641,23 @@
       <w:pPr>
         <w:pStyle w:val="Standard"/>
         <w:jc w:val="both"/>
-      </w:pPr>
-    </w:p>
-    <w:p>
-      <w:pPr>
-        <w:pStyle w:val="Standard"/>
-        <w:jc w:val="both"/>
-      </w:pPr>
-      <w:r>
+        <w:rPr>
+          <w:rFonts w:ascii="Times New Roman" w:hAnsi="Times New Roman" w:cs="Times New Roman"/>
+        </w:rPr>
+      </w:pPr>
+    </w:p>
+    <w:p>
+      <w:pPr>
+        <w:pStyle w:val="Standard"/>
+        <w:jc w:val="both"/>
+        <w:rPr>
+          <w:rFonts w:ascii="Times New Roman" w:hAnsi="Times New Roman" w:cs="Times New Roman"/>
+        </w:rPr>
+      </w:pPr>
+      <w:r>
+        <w:rPr>
+          <w:rFonts w:ascii="Times New Roman" w:hAnsi="Times New Roman" w:cs="Times New Roman"/>
+        </w:rPr>
         <w:t>${/abertura}</w:t>
       </w:r>
     </w:p>
@@ -551,8 +665,14 @@
       <w:pPr>
         <w:pStyle w:val="Standard"/>
         <w:jc w:val="both"/>
-      </w:pPr>
-      <w:r>
+        <w:rPr>
+          <w:rFonts w:ascii="Times New Roman" w:hAnsi="Times New Roman" w:cs="Times New Roman"/>
+        </w:rPr>
+      </w:pPr>
+      <w:r>
+        <w:rPr>
+          <w:rFonts w:ascii="Times New Roman" w:hAnsi="Times New Roman" w:cs="Times New Roman"/>
+        </w:rPr>
         <w:t>${limite}</w:t>
       </w:r>
     </w:p>
@@ -561,44 +681,73 @@
         <w:pStyle w:val="Standard"/>
         <w:ind w:firstLine="1134"/>
         <w:jc w:val="both"/>
-      </w:pPr>
-      <w:r>
-        <w:rPr>
+        <w:rPr>
+          <w:rFonts w:ascii="Times New Roman" w:hAnsi="Times New Roman" w:cs="Times New Roman"/>
+        </w:rPr>
+      </w:pPr>
+      <w:r>
+        <w:rPr>
+          <w:rFonts w:ascii="Times New Roman" w:hAnsi="Times New Roman" w:cs="Times New Roman"/>
           <w:b/>
         </w:rPr>
         <w:t>Art. ${artigo}º</w:t>
       </w:r>
       <w:r>
+        <w:rPr>
+          <w:rFonts w:ascii="Times New Roman" w:hAnsi="Times New Roman" w:cs="Times New Roman"/>
+        </w:rPr>
         <w:t xml:space="preserve"> O percentual de suplementação autorizado na Lei Orçamentária</w:t>
       </w:r>
       <w:r>
+        <w:rPr>
+          <w:rFonts w:ascii="Times New Roman" w:hAnsi="Times New Roman" w:cs="Times New Roman"/>
+        </w:rPr>
         <w:t xml:space="preserve"> </w:t>
       </w:r>
       <w:r>
+        <w:rPr>
+          <w:rFonts w:ascii="Times New Roman" w:hAnsi="Times New Roman" w:cs="Times New Roman"/>
+        </w:rPr>
         <w:t xml:space="preserve">alcança </w:t>
       </w:r>
       <w:r>
+        <w:rPr>
+          <w:rFonts w:ascii="Times New Roman" w:hAnsi="Times New Roman" w:cs="Times New Roman"/>
+        </w:rPr>
         <w:t>${</w:t>
       </w:r>
       <w:proofErr w:type="spellStart"/>
       <w:r>
+        <w:rPr>
+          <w:rFonts w:ascii="Times New Roman" w:hAnsi="Times New Roman" w:cs="Times New Roman"/>
+        </w:rPr>
         <w:t>percentualLimite</w:t>
       </w:r>
       <w:proofErr w:type="spellEnd"/>
       <w:r>
+        <w:rPr>
+          <w:rFonts w:ascii="Times New Roman" w:hAnsi="Times New Roman" w:cs="Times New Roman"/>
+        </w:rPr>
         <w:t>}</w:t>
       </w:r>
       <w:r>
         <w:rPr>
+          <w:rFonts w:ascii="Times New Roman" w:hAnsi="Times New Roman" w:cs="Times New Roman"/>
           <w:b/>
           <w:bCs/>
         </w:rPr>
         <w:t>%</w:t>
       </w:r>
       <w:r>
+        <w:rPr>
+          <w:rFonts w:ascii="Times New Roman" w:hAnsi="Times New Roman" w:cs="Times New Roman"/>
+        </w:rPr>
         <w:t xml:space="preserve"> com este Decreto</w:t>
       </w:r>
       <w:r>
+        <w:rPr>
+          <w:rFonts w:ascii="Times New Roman" w:hAnsi="Times New Roman" w:cs="Times New Roman"/>
+        </w:rPr>
         <w:t>.</w:t>
       </w:r>
     </w:p>
@@ -606,8 +755,14 @@
       <w:pPr>
         <w:pStyle w:val="Standard"/>
         <w:jc w:val="both"/>
-      </w:pPr>
-      <w:r>
+        <w:rPr>
+          <w:rFonts w:ascii="Times New Roman" w:hAnsi="Times New Roman" w:cs="Times New Roman"/>
+        </w:rPr>
+      </w:pPr>
+      <w:r>
+        <w:rPr>
+          <w:rFonts w:ascii="Times New Roman" w:hAnsi="Times New Roman" w:cs="Times New Roman"/>
+        </w:rPr>
         <w:t>${/limite}</w:t>
       </w:r>
     </w:p>
@@ -615,6 +770,9 @@
       <w:pPr>
         <w:pStyle w:val="Standard"/>
         <w:jc w:val="both"/>
+        <w:rPr>
+          <w:rFonts w:ascii="Times New Roman" w:hAnsi="Times New Roman" w:cs="Times New Roman"/>
+        </w:rPr>
       </w:pPr>
     </w:p>
     <w:p>
@@ -622,14 +780,21 @@
         <w:pStyle w:val="Standard"/>
         <w:ind w:firstLine="1134"/>
         <w:jc w:val="both"/>
-      </w:pPr>
-      <w:r>
-        <w:rPr>
+        <w:rPr>
+          <w:rFonts w:ascii="Times New Roman" w:hAnsi="Times New Roman" w:cs="Times New Roman"/>
+        </w:rPr>
+      </w:pPr>
+      <w:r>
+        <w:rPr>
+          <w:rFonts w:ascii="Times New Roman" w:hAnsi="Times New Roman" w:cs="Times New Roman"/>
           <w:b/>
         </w:rPr>
         <w:t>Art. ${artigo}º</w:t>
       </w:r>
       <w:r>
+        <w:rPr>
+          <w:rFonts w:ascii="Times New Roman" w:hAnsi="Times New Roman" w:cs="Times New Roman"/>
+        </w:rPr>
         <w:t xml:space="preserve"> O presente decreto entra em vigor na data de sua publicação.</w:t>
       </w:r>
     </w:p>
@@ -638,6 +803,9 @@
         <w:pStyle w:val="Standard"/>
         <w:ind w:firstLine="1134"/>
         <w:jc w:val="both"/>
+        <w:rPr>
+          <w:rFonts w:ascii="Times New Roman" w:hAnsi="Times New Roman" w:cs="Times New Roman"/>
+        </w:rPr>
       </w:pPr>
     </w:p>
     <w:p>
@@ -645,9 +813,13 @@
         <w:pStyle w:val="Standard"/>
         <w:ind w:firstLine="1080"/>
         <w:jc w:val="both"/>
-      </w:pPr>
-      <w:r>
-        <w:rPr>
+        <w:rPr>
+          <w:rFonts w:ascii="Times New Roman" w:hAnsi="Times New Roman" w:cs="Times New Roman"/>
+        </w:rPr>
+      </w:pPr>
+      <w:r>
+        <w:rPr>
+          <w:rFonts w:ascii="Times New Roman" w:hAnsi="Times New Roman" w:cs="Times New Roman"/>
           <w:b/>
           <w:caps/>
         </w:rPr>
@@ -655,6 +827,7 @@
       </w:r>
       <w:r>
         <w:rPr>
+          <w:rFonts w:ascii="Times New Roman" w:hAnsi="Times New Roman" w:cs="Times New Roman"/>
           <w:b/>
           <w:caps/>
         </w:rPr>
@@ -662,6 +835,7 @@
       </w:r>
       <w:r>
         <w:rPr>
+          <w:rFonts w:ascii="Times New Roman" w:hAnsi="Times New Roman" w:cs="Times New Roman"/>
           <w:b/>
           <w:caps/>
         </w:rPr>
@@ -669,6 +843,7 @@
       </w:r>
       <w:r>
         <w:rPr>
+          <w:rFonts w:ascii="Times New Roman" w:hAnsi="Times New Roman" w:cs="Times New Roman"/>
           <w:b/>
           <w:caps/>
         </w:rPr>
@@ -676,6 +851,7 @@
       </w:r>
       <w:r>
         <w:rPr>
+          <w:rFonts w:ascii="Times New Roman" w:hAnsi="Times New Roman" w:cs="Times New Roman"/>
           <w:b/>
           <w:caps/>
         </w:rPr>
@@ -683,6 +859,7 @@
       </w:r>
       <w:r>
         <w:rPr>
+          <w:rFonts w:ascii="Times New Roman" w:hAnsi="Times New Roman" w:cs="Times New Roman"/>
           <w:b/>
           <w:caps/>
         </w:rPr>
@@ -695,6 +872,7 @@
         <w:ind w:firstLine="1080"/>
         <w:jc w:val="both"/>
         <w:rPr>
+          <w:rFonts w:ascii="Times New Roman" w:hAnsi="Times New Roman" w:cs="Times New Roman"/>
           <w:b/>
         </w:rPr>
       </w:pPr>
@@ -704,6 +882,7 @@
         <w:pStyle w:val="Standard"/>
         <w:jc w:val="center"/>
         <w:rPr>
+          <w:rFonts w:ascii="Times New Roman" w:hAnsi="Times New Roman" w:cs="Times New Roman"/>
           <w:b/>
         </w:rPr>
       </w:pPr>
@@ -713,6 +892,7 @@
         <w:pStyle w:val="Standard"/>
         <w:jc w:val="center"/>
         <w:rPr>
+          <w:rFonts w:ascii="Times New Roman" w:hAnsi="Times New Roman" w:cs="Times New Roman"/>
           <w:b/>
         </w:rPr>
       </w:pPr>
@@ -722,11 +902,13 @@
         <w:pStyle w:val="Standard"/>
         <w:jc w:val="center"/>
         <w:rPr>
-          <w:b/>
-        </w:rPr>
-      </w:pPr>
-      <w:r>
-        <w:rPr>
+          <w:rFonts w:ascii="Times New Roman" w:hAnsi="Times New Roman" w:cs="Times New Roman"/>
+          <w:b/>
+        </w:rPr>
+      </w:pPr>
+      <w:r>
+        <w:rPr>
+          <w:rFonts w:ascii="Times New Roman" w:hAnsi="Times New Roman" w:cs="Times New Roman"/>
           <w:b/>
         </w:rPr>
         <w:t>EDUARDO MARASCA</w:t>
@@ -737,17 +919,20 @@
         <w:pStyle w:val="Standard"/>
         <w:jc w:val="center"/>
         <w:rPr>
+          <w:rFonts w:ascii="Times New Roman" w:hAnsi="Times New Roman" w:cs="Times New Roman"/>
           <w:bCs/>
         </w:rPr>
       </w:pPr>
       <w:r>
         <w:rPr>
+          <w:rFonts w:ascii="Times New Roman" w:hAnsi="Times New Roman" w:cs="Times New Roman"/>
           <w:b/>
         </w:rPr>
         <w:t xml:space="preserve"> </w:t>
       </w:r>
       <w:r>
         <w:rPr>
+          <w:rFonts w:ascii="Times New Roman" w:hAnsi="Times New Roman" w:cs="Times New Roman"/>
           <w:bCs/>
         </w:rPr>
         <w:t>Prefeito Municipal</w:t>
@@ -758,6 +943,7 @@
         <w:pStyle w:val="Standard"/>
         <w:jc w:val="center"/>
         <w:rPr>
+          <w:rFonts w:ascii="Times New Roman" w:hAnsi="Times New Roman" w:cs="Times New Roman"/>
           <w:b/>
         </w:rPr>
       </w:pPr>
@@ -767,6 +953,7 @@
         <w:pStyle w:val="Standard"/>
         <w:jc w:val="center"/>
         <w:rPr>
+          <w:rFonts w:ascii="Times New Roman" w:hAnsi="Times New Roman" w:cs="Times New Roman"/>
           <w:b/>
         </w:rPr>
       </w:pPr>
@@ -777,6 +964,7 @@
         <w:ind w:right="85"/>
         <w:jc w:val="both"/>
         <w:rPr>
+          <w:rFonts w:ascii="Times New Roman" w:hAnsi="Times New Roman" w:cs="Times New Roman"/>
           <w:b/>
           <w:i/>
           <w:lang w:val="en-US"/>
@@ -792,77 +980,50 @@
       </w:r>
       <w:r>
         <w:rPr>
+          <w:rFonts w:ascii="Times New Roman" w:hAnsi="Times New Roman" w:cs="Times New Roman"/>
           <w:b/>
           <w:bCs/>
           <w:lang w:val="en-US"/>
         </w:rPr>
-        <w:t>D</w:t>
-      </w:r>
-      <w:r>
-        <w:rPr>
-          <w:b/>
-          <w:bCs/>
+        <w:t>Dilson José Welter</w:t>
+      </w:r>
+      <w:r>
+        <w:rPr>
+          <w:rFonts w:ascii="Times New Roman" w:eastAsia="Times New Roman" w:hAnsi="Times New Roman" w:cs="Times New Roman"/>
+          <w:b/>
           <w:lang w:val="en-US"/>
         </w:rPr>
-        <w:t>ilson</w:t>
-      </w:r>
-      <w:r>
-        <w:rPr>
-          <w:b/>
-          <w:bCs/>
-          <w:lang w:val="en-US"/>
-        </w:rPr>
-        <w:t xml:space="preserve"> J</w:t>
-      </w:r>
-      <w:r>
-        <w:rPr>
-          <w:b/>
-          <w:bCs/>
-          <w:lang w:val="en-US"/>
-        </w:rPr>
-        <w:t>osé</w:t>
-      </w:r>
-      <w:r>
-        <w:rPr>
-          <w:b/>
-          <w:bCs/>
-          <w:lang w:val="en-US"/>
-        </w:rPr>
-        <w:t xml:space="preserve"> W</w:t>
-      </w:r>
-      <w:r>
-        <w:rPr>
-          <w:b/>
-          <w:bCs/>
-          <w:lang w:val="en-US"/>
-        </w:rPr>
-        <w:t>elter</w:t>
-      </w:r>
-      <w:r>
+        <w:t xml:space="preserve">                                     </w:t>
+      </w:r>
+    </w:p>
+    <w:p>
+      <w:pPr>
+        <w:pStyle w:val="Standard"/>
+        <w:jc w:val="both"/>
+        <w:rPr>
+          <w:rFonts w:ascii="Times New Roman" w:hAnsi="Times New Roman" w:cs="Times New Roman"/>
+          <w:b/>
+          <w:i/>
+        </w:rPr>
+      </w:pPr>
+      <w:r>
+        <w:rPr>
+          <w:rFonts w:ascii="Times New Roman" w:hAnsi="Times New Roman" w:cs="Times New Roman"/>
+          <w:b/>
+          <w:i/>
+        </w:rPr>
+        <w:t>Secretário de Administração                                     Secretário da Fazenda</w:t>
+      </w:r>
+    </w:p>
+    <w:p>
+      <w:pPr>
+        <w:pStyle w:val="Standard"/>
+        <w:jc w:val="both"/>
         <w:rPr>
           <w:rFonts w:ascii="Times New Roman" w:eastAsia="Times New Roman" w:hAnsi="Times New Roman" w:cs="Times New Roman"/>
           <w:b/>
-          <w:lang w:val="en-US"/>
-        </w:rPr>
-        <w:t xml:space="preserve">                                     </w:t>
-      </w:r>
-    </w:p>
-    <w:p>
-      <w:pPr>
-        <w:pStyle w:val="Standard"/>
-        <w:jc w:val="both"/>
-        <w:rPr>
-          <w:b/>
-          <w:i/>
-        </w:rPr>
-      </w:pPr>
-      <w:r>
-        <w:rPr>
-          <w:b/>
-          <w:i/>
-        </w:rPr>
-        <w:t>Secretário de Administração                                     Secretário da Fazenda</w:t>
-      </w:r>
+        </w:rPr>
+      </w:pPr>
     </w:p>
     <w:p>
       <w:pPr>
@@ -909,21 +1070,13 @@
         <w:pStyle w:val="Standard"/>
         <w:jc w:val="both"/>
         <w:rPr>
-          <w:rFonts w:ascii="Times New Roman" w:eastAsia="Times New Roman" w:hAnsi="Times New Roman" w:cs="Times New Roman"/>
-          <w:b/>
-        </w:rPr>
-      </w:pPr>
-    </w:p>
-    <w:p>
-      <w:pPr>
-        <w:pStyle w:val="Standard"/>
-        <w:jc w:val="both"/>
-        <w:rPr>
-          <w:b/>
-        </w:rPr>
-      </w:pPr>
-      <w:r>
-        <w:rPr>
+          <w:rFonts w:ascii="Times New Roman" w:hAnsi="Times New Roman" w:cs="Times New Roman"/>
+          <w:b/>
+        </w:rPr>
+      </w:pPr>
+      <w:r>
+        <w:rPr>
+          <w:rFonts w:ascii="Times New Roman" w:hAnsi="Times New Roman" w:cs="Times New Roman"/>
           <w:b/>
         </w:rPr>
         <w:t xml:space="preserve">Registre–se, publique–se </w:t>
@@ -931,6 +1084,7 @@
       <w:proofErr w:type="gramStart"/>
       <w:r>
         <w:rPr>
+          <w:rFonts w:ascii="Times New Roman" w:hAnsi="Times New Roman" w:cs="Times New Roman"/>
           <w:b/>
         </w:rPr>
         <w:t>e</w:t>
@@ -938,6 +1092,7 @@
       <w:proofErr w:type="gramEnd"/>
       <w:r>
         <w:rPr>
+          <w:rFonts w:ascii="Times New Roman" w:hAnsi="Times New Roman" w:cs="Times New Roman"/>
           <w:b/>
         </w:rPr>
         <w:t xml:space="preserve"> cumpra-se.</w:t>
@@ -948,12 +1103,14 @@
         <w:suppressAutoHyphens w:val="0"/>
         <w:textAlignment w:val="auto"/>
         <w:rPr>
+          <w:rFonts w:ascii="Times New Roman" w:hAnsi="Times New Roman" w:cs="Times New Roman"/>
           <w:b/>
           <w:color w:val="00000A"/>
         </w:rPr>
       </w:pPr>
       <w:r>
         <w:rPr>
+          <w:rFonts w:ascii="Times New Roman" w:hAnsi="Times New Roman" w:cs="Times New Roman"/>
           <w:b/>
         </w:rPr>
         <w:lastRenderedPageBreak/>
@@ -965,6 +1122,7 @@
         <w:pStyle w:val="Standard"/>
         <w:jc w:val="both"/>
         <w:rPr>
+          <w:rFonts w:ascii="Times New Roman" w:hAnsi="Times New Roman" w:cs="Times New Roman"/>
           <w:b/>
         </w:rPr>
         <w:sectPr>
@@ -983,11 +1141,13 @@
         <w:pStyle w:val="Standard"/>
         <w:jc w:val="center"/>
         <w:rPr>
-          <w:b/>
-        </w:rPr>
-      </w:pPr>
-      <w:r>
-        <w:rPr>
+          <w:rFonts w:ascii="Times New Roman" w:hAnsi="Times New Roman" w:cs="Times New Roman"/>
+          <w:b/>
+        </w:rPr>
+      </w:pPr>
+      <w:r>
+        <w:rPr>
+          <w:rFonts w:ascii="Times New Roman" w:hAnsi="Times New Roman" w:cs="Times New Roman"/>
           <w:b/>
         </w:rPr>
         <w:lastRenderedPageBreak/>
@@ -995,18 +1155,21 @@
       </w:r>
       <w:r>
         <w:rPr>
+          <w:rFonts w:ascii="Times New Roman" w:hAnsi="Times New Roman" w:cs="Times New Roman"/>
           <w:b/>
         </w:rPr>
         <w:t xml:space="preserve">AO </w:t>
       </w:r>
       <w:r>
         <w:rPr>
+          <w:rFonts w:ascii="Times New Roman" w:hAnsi="Times New Roman" w:cs="Times New Roman"/>
           <w:b/>
         </w:rPr>
         <w:t xml:space="preserve">DECRETO Nº </w:t>
       </w:r>
       <w:r>
         <w:rPr>
+          <w:rFonts w:ascii="Times New Roman" w:hAnsi="Times New Roman" w:cs="Times New Roman"/>
           <w:b/>
         </w:rPr>
         <w:t>${</w:t>
@@ -1014,6 +1177,7 @@
       <w:proofErr w:type="spellStart"/>
       <w:r>
         <w:rPr>
+          <w:rFonts w:ascii="Times New Roman" w:hAnsi="Times New Roman" w:cs="Times New Roman"/>
           <w:b/>
         </w:rPr>
         <w:t>nrDecreto</w:t>
@@ -1021,6 +1185,7 @@
       <w:proofErr w:type="spellEnd"/>
       <w:r>
         <w:rPr>
+          <w:rFonts w:ascii="Times New Roman" w:hAnsi="Times New Roman" w:cs="Times New Roman"/>
           <w:b/>
         </w:rPr>
         <w:t>}/${</w:t>
@@ -1028,6 +1193,7 @@
       <w:proofErr w:type="spellStart"/>
       <w:r>
         <w:rPr>
+          <w:rFonts w:ascii="Times New Roman" w:hAnsi="Times New Roman" w:cs="Times New Roman"/>
           <w:b/>
         </w:rPr>
         <w:t>exercicio</w:t>
@@ -1035,6 +1201,7 @@
       <w:proofErr w:type="spellEnd"/>
       <w:r>
         <w:rPr>
+          <w:rFonts w:ascii="Times New Roman" w:hAnsi="Times New Roman" w:cs="Times New Roman"/>
           <w:b/>
         </w:rPr>
         <w:t>}</w:t>
@@ -1044,6 +1211,9 @@
       <w:pPr>
         <w:pStyle w:val="Standard"/>
         <w:jc w:val="center"/>
+        <w:rPr>
+          <w:rFonts w:ascii="Times New Roman" w:hAnsi="Times New Roman" w:cs="Times New Roman"/>
+        </w:rPr>
       </w:pPr>
     </w:p>
     <w:p>
@@ -1052,16 +1222,28 @@
         <w:tabs>
           <w:tab w:val="right" w:leader="dot" w:pos="9070"/>
         </w:tabs>
-      </w:pPr>
-      <w:r>
+        <w:rPr>
+          <w:rFonts w:ascii="Times New Roman" w:hAnsi="Times New Roman" w:cs="Times New Roman"/>
+        </w:rPr>
+      </w:pPr>
+      <w:r>
+        <w:rPr>
+          <w:rFonts w:ascii="Times New Roman" w:hAnsi="Times New Roman" w:cs="Times New Roman"/>
+        </w:rPr>
         <w:t>${</w:t>
       </w:r>
       <w:proofErr w:type="spellStart"/>
       <w:r>
+        <w:rPr>
+          <w:rFonts w:ascii="Times New Roman" w:hAnsi="Times New Roman" w:cs="Times New Roman"/>
+        </w:rPr>
         <w:t>itemAnexo</w:t>
       </w:r>
       <w:proofErr w:type="spellEnd"/>
       <w:r>
+        <w:rPr>
+          <w:rFonts w:ascii="Times New Roman" w:hAnsi="Times New Roman" w:cs="Times New Roman"/>
+        </w:rPr>
         <w:t>}</w:t>
       </w:r>
     </w:p>
@@ -1072,12 +1254,14 @@
           <w:tab w:val="right" w:leader="dot" w:pos="9070"/>
         </w:tabs>
         <w:rPr>
+          <w:rFonts w:ascii="Times New Roman" w:hAnsi="Times New Roman" w:cs="Times New Roman"/>
           <w:b/>
           <w:bCs/>
         </w:rPr>
       </w:pPr>
       <w:r>
         <w:rPr>
+          <w:rFonts w:ascii="Times New Roman" w:hAnsi="Times New Roman" w:cs="Times New Roman"/>
           <w:b/>
           <w:bCs/>
         </w:rPr>
@@ -1087,6 +1271,7 @@
       <w:proofErr w:type="gramStart"/>
       <w:r>
         <w:rPr>
+          <w:rFonts w:ascii="Times New Roman" w:hAnsi="Times New Roman" w:cs="Times New Roman"/>
           <w:b/>
           <w:bCs/>
         </w:rPr>
@@ -1095,6 +1280,7 @@
       <w:proofErr w:type="spellEnd"/>
       <w:r>
         <w:rPr>
+          <w:rFonts w:ascii="Times New Roman" w:hAnsi="Times New Roman" w:cs="Times New Roman"/>
           <w:b/>
           <w:bCs/>
         </w:rPr>
@@ -1102,6 +1288,7 @@
       </w:r>
       <w:r>
         <w:rPr>
+          <w:rFonts w:ascii="Times New Roman" w:hAnsi="Times New Roman" w:cs="Times New Roman"/>
           <w:b/>
           <w:bCs/>
         </w:rPr>
@@ -1109,6 +1296,7 @@
       </w:r>
       <w:r>
         <w:rPr>
+          <w:rFonts w:ascii="Times New Roman" w:hAnsi="Times New Roman" w:cs="Times New Roman"/>
           <w:b/>
           <w:bCs/>
         </w:rPr>
@@ -1117,6 +1305,7 @@
       <w:proofErr w:type="gramEnd"/>
       <w:r>
         <w:rPr>
+          <w:rFonts w:ascii="Times New Roman" w:hAnsi="Times New Roman" w:cs="Times New Roman"/>
           <w:b/>
           <w:bCs/>
         </w:rPr>
@@ -1125,6 +1314,7 @@
       <w:proofErr w:type="spellStart"/>
       <w:r>
         <w:rPr>
+          <w:rFonts w:ascii="Times New Roman" w:hAnsi="Times New Roman" w:cs="Times New Roman"/>
           <w:b/>
           <w:bCs/>
         </w:rPr>
@@ -1133,6 +1323,7 @@
       <w:proofErr w:type="spellEnd"/>
       <w:r>
         <w:rPr>
+          <w:rFonts w:ascii="Times New Roman" w:hAnsi="Times New Roman" w:cs="Times New Roman"/>
           <w:b/>
           <w:bCs/>
         </w:rPr>
@@ -1140,6 +1331,7 @@
       </w:r>
       <w:r>
         <w:rPr>
+          <w:rFonts w:ascii="Times New Roman" w:hAnsi="Times New Roman" w:cs="Times New Roman"/>
           <w:b/>
           <w:bCs/>
         </w:rPr>
@@ -1149,6 +1341,7 @@
       <w:proofErr w:type="spellStart"/>
       <w:r>
         <w:rPr>
+          <w:rFonts w:ascii="Times New Roman" w:hAnsi="Times New Roman" w:cs="Times New Roman"/>
           <w:b/>
           <w:bCs/>
         </w:rPr>
@@ -1157,6 +1350,7 @@
       <w:proofErr w:type="spellEnd"/>
       <w:r>
         <w:rPr>
+          <w:rFonts w:ascii="Times New Roman" w:hAnsi="Times New Roman" w:cs="Times New Roman"/>
           <w:b/>
           <w:bCs/>
         </w:rPr>
@@ -1170,12 +1364,14 @@
           <w:tab w:val="right" w:leader="dot" w:pos="9070"/>
         </w:tabs>
         <w:rPr>
+          <w:rFonts w:ascii="Times New Roman" w:hAnsi="Times New Roman" w:cs="Times New Roman"/>
           <w:i/>
           <w:iCs/>
         </w:rPr>
       </w:pPr>
       <w:r>
         <w:rPr>
+          <w:rFonts w:ascii="Times New Roman" w:hAnsi="Times New Roman" w:cs="Times New Roman"/>
           <w:i/>
           <w:iCs/>
         </w:rPr>
@@ -1184,6 +1380,7 @@
       <w:proofErr w:type="spellStart"/>
       <w:r>
         <w:rPr>
+          <w:rFonts w:ascii="Times New Roman" w:hAnsi="Times New Roman" w:cs="Times New Roman"/>
           <w:i/>
           <w:iCs/>
         </w:rPr>
@@ -1192,6 +1389,7 @@
       <w:proofErr w:type="spellEnd"/>
       <w:r>
         <w:rPr>
+          <w:rFonts w:ascii="Times New Roman" w:hAnsi="Times New Roman" w:cs="Times New Roman"/>
           <w:i/>
           <w:iCs/>
         </w:rPr>
@@ -1200,6 +1398,7 @@
       <w:proofErr w:type="spellStart"/>
       <w:r>
         <w:rPr>
+          <w:rFonts w:ascii="Times New Roman" w:hAnsi="Times New Roman" w:cs="Times New Roman"/>
           <w:i/>
           <w:iCs/>
         </w:rPr>
@@ -1208,6 +1407,7 @@
       <w:proofErr w:type="spellEnd"/>
       <w:r>
         <w:rPr>
+          <w:rFonts w:ascii="Times New Roman" w:hAnsi="Times New Roman" w:cs="Times New Roman"/>
           <w:i/>
           <w:iCs/>
         </w:rPr>
@@ -1220,6 +1420,9 @@
         <w:tabs>
           <w:tab w:val="right" w:leader="dot" w:pos="9070"/>
         </w:tabs>
+        <w:rPr>
+          <w:rFonts w:ascii="Times New Roman" w:hAnsi="Times New Roman" w:cs="Times New Roman"/>
+        </w:rPr>
       </w:pPr>
     </w:p>
     <w:p>
@@ -1229,19 +1432,29 @@
           <w:tab w:val="right" w:leader="dot" w:pos="9070"/>
         </w:tabs>
         <w:rPr>
+          <w:rFonts w:ascii="Times New Roman" w:hAnsi="Times New Roman" w:cs="Times New Roman"/>
           <w:i/>
           <w:iCs/>
         </w:rPr>
       </w:pPr>
       <w:r>
+        <w:rPr>
+          <w:rFonts w:ascii="Times New Roman" w:hAnsi="Times New Roman" w:cs="Times New Roman"/>
+        </w:rPr>
         <w:t>${/</w:t>
       </w:r>
       <w:proofErr w:type="spellStart"/>
       <w:r>
+        <w:rPr>
+          <w:rFonts w:ascii="Times New Roman" w:hAnsi="Times New Roman" w:cs="Times New Roman"/>
+        </w:rPr>
         <w:t>itemAnexo</w:t>
       </w:r>
       <w:proofErr w:type="spellEnd"/>
       <w:r>
+        <w:rPr>
+          <w:rFonts w:ascii="Times New Roman" w:hAnsi="Times New Roman" w:cs="Times New Roman"/>
+        </w:rPr>
         <w:t>}</w:t>
       </w:r>
     </w:p>

</xml_diff>